<commit_message>
Add ContextualJailbreak paper to Engineer CV research section
Cites Cortés-Delgado, F. J. and Rodríguez, M., et al. (2026),
arXiv:2605.02647, alongside the existing REMINDER publication.

Co-Authored-By: Claude Sonnet 5 <noreply@anthropic.com>
</commit_message>
<xml_diff>
--- a/dist/CV_FranCortes.docx
+++ b/dist/CV_FranCortes.docx
@@ -1808,6 +1808,28 @@
                 <w:color w:val="D9D9D9"/>
                 <w:sz w:val="17"/>
               </w:rPr>
+              <w:t xml:space="preserve"> and Rodríguez, M., et al. (2026). ContextualJailbreak: Evolutionary Red-Teaming via Simulated Conversational Priming. arXiv:2605.02647. Black-box evolutionary search over simulated multi-turn primed dialogue, guided by a graded 0-5 harm score from a two-level judge. Across 50 HarmBench behaviors reaches 100% ASR on gpt-oss:20B, qwen3-8B, and llama3.1:70B, and 90% on gpt-oss:120B; the 40 most harmful attacks transfer without adaptation to closed frontier models (90% gpt-4o-mini, 70% gpt-5, 70% gemini-3-flash), revealing a pronounced provider-level asymmetry in alignment robustness.</w:t>
+            </w:r>
+          </w:p>
+          <w:p>
+            <w:pPr>
+              <w:pStyle w:val="ListBullet"/>
+              <w:spacing w:after="20"/>
+              <w:ind w:left="317"/>
+            </w:pPr>
+            <w:r>
+              <w:rPr>
+                <w:b/>
+                <w:color w:val="D9D9D9"/>
+                <w:sz w:val="17"/>
+              </w:rPr>
+              <w:t>Cortés-Delgado, F. J.</w:t>
+            </w:r>
+            <w:r>
+              <w:rPr>
+                <w:color w:val="D9D9D9"/>
+                <w:sz w:val="17"/>
+              </w:rPr>
               <w:t>, Mármol Campos, E., Hernández-Ramos, J. L., Skarmeta, A., Latif, S., Djenouri, D., Krenn, S., Puiu, A., &amp; Vizitiu, A. (2026). Enhancing security and privacy in federated learning for distributed systems: The REMINDER approach. In Proceedings of the Global IoT and Edge Computing Summit (GIECS 2025) (pp. 57–70). Springer. doi.org/10.1007/978-3-032-09555-8_4</w:t>
             </w:r>
           </w:p>

</xml_diff>

<commit_message>
Fix CV dropdown not opening on mobile; add IBM/Flower links to CVs
- CVMenu: reparent the dropdown list to <body> and position it with
  fixed coordinates computed in JS. Previously the mobile icon row's
  overflow-x: auto silently clipped the dropdown, so tapping the CV
  button on phones opened it (state toggled) but nothing appeared.
- Add the IBM ARES commit link to the IBM entry and the Flower issue
  link to the Cambridge entry in both the Researcher and Engineer CVs.

Co-Authored-By: Claude Sonnet 5 <noreply@anthropic.com>
</commit_message>
<xml_diff>
--- a/dist/CV_FranCortes.docx
+++ b/dist/CV_FranCortes.docx
@@ -322,7 +322,7 @@
                 <w:color w:val="D9D9D9"/>
                 <w:sz w:val="17"/>
               </w:rPr>
-              <w:t>Academic research in agentic red teaming, targeting LLMs, focused on identifying vulnerabilities and evaluating model robustness, collaborating with Nic Lane's group (CaMLSys Lab, University of Cambridge); collaboration ongoing.</w:t>
+              <w:t>Academic research in agentic red teaming, targeting LLMs, focused on identifying vulnerabilities and evaluating model robustness, collaborating with Nic Lane's group (CaMLSys Lab, University of Cambridge); collaboration ongoing. Contributed to the Flower federated learning framework: github.com/flwrlabs/flower/issues/6039</w:t>
             </w:r>
           </w:p>
           <w:tbl>
@@ -453,7 +453,7 @@
                 <w:color w:val="D9D9D9"/>
                 <w:sz w:val="17"/>
               </w:rPr>
-              <w:t>Contributed to academic research and the development of a red teaming system targeting LLMs, focusing on identifying vulnerabilities and evaluating model robustness); collaboration ongoing.</w:t>
+              <w:t>Contributed to academic research and the development of a red teaming system targeting LLMs, focusing on identifying vulnerabilities and evaluating model robustness); collaboration ongoing. github.com/IBM/ares/commit/c0e0b69f92a865cdf3d51b792835a511d028a6f5</w:t>
             </w:r>
           </w:p>
           <w:tbl>

</xml_diff>